<commit_message>
feat: Gari UI completa — boton generar, tab Documento Gari, descarga autenticada, encoding fix
</commit_message>
<xml_diff>
--- a/backend/storage/cases/case-22/draft/CAS-2026-0003_gari.docx
+++ b/backend/storage/cases/case-22/draft/CAS-2026-0003_gari.docx
@@ -82,7 +82,7 @@
         <w:jc w:val="both"/>
       </w:pPr>
       <w:r>
-        <w:t>Capítulo IV: Facultades Especiales. [[--]] Autocontratación (Artículo 2170 Código Civil): Queda mi apoderada expresamente facultada para auto contratar. Podrá, por tanto, comprar para sí o para un tercero los bienes que yo le he ordenado vender, o venderme bienes de su propiedad. Esta autorización se confiere de manera explícita para sanear cualquier posible conflicto de interés. [[--]] Afectación a Vivienda Familiar: Declarar el estado civil del poderdante al momento de cualquier acto y, en consecuencia, constituir o cancelar la Afectación a Vivienda Familiar sobre cualquier inmueble, según lo dispuesto en la Ley 258 de 1996. [[--]] Continuación del Mandato Post-Mortem (Artículo 2195 Código Civil): Es mi voluntad expresa que, en caso de mi fallecimiento, el presente mandato no se extinga. Mi apoderada deberá continuar con la ejecución de los actos que se encuentren pendientes hasta su culminación. [[--]]</w:t>
+        <w:t>Capítulo IV: Facultades Especiales. [[--]] Autocontratación (Artículo 2170 Código Civil): Queda mi apoderada expresamente facultada para auto contratar. Podrá, por tanto, comprar para sí o para un tercero los bienes que yo le he ordenado vender, o venderme bienes de su propiedad. Esta autorización se confiere de manera explícita para sanear cualquier posible conflicto de interés. [[--]] Afectación a Vivienda Familiar: Declarar el estado civil del poderdante al momento de cualquier acto y, en consecuencia, constituir o cancelar la Afectación a Vivienda Familiar sobre cualquier inmueble, según lo dispuesto en la Ley 258 de 1996. [[--]] Continuación del Mandato Post-Mortem (Artículo 2195 Código Civil): Es mi voluntad expresa que, en caso de mi fallecimiento, el presente mandato no se extinga. Mi apoderada deberá continuar con la ejecución de los actos que se encuentren pendientes hasta su conclusión. [[--]]</w:t>
       </w:r>
     </w:p>
     <w:p/>
@@ -91,7 +91,7 @@
         <w:jc w:val="both"/>
       </w:pPr>
       <w:r>
-        <w:t>Constancias Notariales: [[--]] Autorización de Tratamiento de Datos: El compareciente autoriza el tratamiento de sus datos personales conforme a lo dispuesto en la Ley 1581 de 2012. [[--]] Advertencia sobre Verificación de Datos: Se advierte al compareciente sobre la obligación de verificar la exactitud de los datos consignados en este documento, conforme al Artículo 102 del Decreto Ley 960 de 1970. [[--]] Deber de Consejo del Notario: El notario ha cumplido con el deber de consejo, informando al compareciente sobre los alcances y efectos legales del presente acto. [[--]]</w:t>
+        <w:t>Constancias Notariales: [[--]] El compareciente ha sido advertido de la obligación de verificar la exactitud de los datos personales consignados en este documento, conforme al artículo 102 del Decreto Ley 960 de 1970. [[--]] Se deja constancia de que el compareciente ha otorgado su autorización para el tratamiento de sus datos personales conforme a lo dispuesto en la Ley 1581 de 2012. [[--]] El notario ha cumplido con el deber de consejo, informando al compareciente sobre el alcance y efectos legales del presente poder. [[--]]</w:t>
       </w:r>
     </w:p>
     <w:p/>
@@ -100,7 +100,7 @@
         <w:jc w:val="both"/>
       </w:pPr>
       <w:r>
-        <w:t>Liquidación de Derechos Notariales: [[--]] Derechos Notariales: $185,000 [[--]] IVA: $35,150 [[--]] Aporte Superintendencia: $6,500 [[--]] Fondo Notariado: $5,200 [[--]] Total: $231,850 [[--]]</w:t>
+        <w:t>Liquidación de Derechos Notariales: [[--]] Derechos notariales: $185,000 [[--]] IVA: $35,150 [[--]] Aporte a la Superintendencia de Notariado y Registro: $6,500 [[--]] Fondo del Notariado: $5,200 [[--]] Total: $231,850 [[--]]</w:t>
       </w:r>
     </w:p>
     <w:p/>
@@ -109,7 +109,41 @@
         <w:jc w:val="both"/>
       </w:pPr>
       <w:r>
-        <w:t>Firmas: [[--]] Firma del Poderdante: ___________________________ Gerónimo Giraldo Campo [[--]] Firma del Apoderado(a): ___________________________ Daniela Campo [[--]] Firma del Notario: ___________________________ Mateo Jaramillo Cadavid [[--]]</w:t>
+        <w:t>Firmas: [[--]] Gerónimo Giraldo Campo [[--]] Daniela Campo [[--]]</w:t>
+      </w:r>
+    </w:p>
+    <w:p/>
+    <w:p>
+      <w:pPr>
+        <w:jc w:val="both"/>
+      </w:pPr>
+      <w:r>
+        <w:t>Doy fe,</w:t>
+      </w:r>
+    </w:p>
+    <w:p/>
+    <w:p>
+      <w:pPr>
+        <w:jc w:val="both"/>
+      </w:pPr>
+      <w:r>
+        <w:t>Mateo Jaramillo Cadavid</w:t>
+      </w:r>
+    </w:p>
+    <w:p>
+      <w:pPr>
+        <w:jc w:val="both"/>
+      </w:pPr>
+      <w:r>
+        <w:t>Notario Titular</w:t>
+      </w:r>
+    </w:p>
+    <w:p>
+      <w:pPr>
+        <w:jc w:val="both"/>
+      </w:pPr>
+      <w:r>
+        <w:t>Notaría Única del Círculo de Bogotá</w:t>
       </w:r>
     </w:p>
     <w:sectPr>

</xml_diff>

<commit_message>
fix: B1 save_gari_document_as_docx sube a Supabase Storage, supabase==2.28.3 en requirements
</commit_message>
<xml_diff>
--- a/backend/storage/cases/case-22/draft/CAS-2026-0003_gari.docx
+++ b/backend/storage/cases/case-22/draft/CAS-2026-0003_gari.docx
@@ -82,7 +82,7 @@
         <w:jc w:val="both"/>
       </w:pPr>
       <w:r>
-        <w:t>Capítulo IV: Facultades Especiales. [[--]] Autocontratación (Artículo 2170 Código Civil): Queda mi apoderada expresamente facultada para auto contratar. Podrá, por tanto, comprar para sí o para un tercero los bienes que yo le he ordenado vender, o venderme bienes de su propiedad. Esta autorización se confiere de manera explícita para sanear cualquier posible conflicto de interés. [[--]] Afectación a Vivienda Familiar: Declarar el estado civil del poderdante al momento de cualquier acto y, en consecuencia, constituir o cancelar la Afectación a Vivienda Familiar sobre cualquier inmueble, según lo dispuesto en la Ley 258 de 1996. [[--]] Continuación del Mandato Post-Mortem (Artículo 2195 Código Civil): Es mi voluntad expresa que, en caso de mi fallecimiento, el presente mandato no se extinga. Mi apoderada deberá continuar con la ejecución de los actos que se encuentren pendientes hasta su conclusión. [[--]]</w:t>
+        <w:t>Capítulo IV: Facultades Especiales. [[--]] Autocontratación (Artículo 2170 Código Civil): Queda mi apoderada expresamente facultada para auto contratar. Podrá, por tanto, comprar para sí o para un tercero los bienes que yo le he ordenado vender, o venderme bienes de su propiedad. Esta autorización se confiere de manera explícita para sanear cualquier posible conflicto de interés. [[--]] Afectación a Vivienda Familiar: Declarar el estado civil del poderdante al momento de cualquier acto y, en consecuencia, constituir o cancelar la Afectación a Vivienda Familiar sobre cualquier inmueble, según lo dispuesto en la Ley 258 de 1996. [[--]] Continuación del Mandato Post-Mortem (Artículo 2195 Código Civil): Es mi voluntad expresa que, en caso de mi fallecimiento, el presente mandato no se extinga. Mi apoderada deberá continuar con la ejecución de los actos que se encuentren pendientes hasta su culminación. [[--]]</w:t>
       </w:r>
     </w:p>
     <w:p/>
@@ -91,7 +91,7 @@
         <w:jc w:val="both"/>
       </w:pPr>
       <w:r>
-        <w:t>Constancias Notariales: [[--]] El compareciente ha sido advertido de la obligación de verificar la exactitud de los datos personales consignados en este documento, conforme al artículo 102 del Decreto Ley 960 de 1970. [[--]] Se deja constancia de que el compareciente ha otorgado su autorización para el tratamiento de sus datos personales conforme a lo dispuesto en la Ley 1581 de 2012. [[--]] El notario ha cumplido con el deber de consejo, informando al compareciente sobre el alcance y efectos legales del presente poder. [[--]]</w:t>
+        <w:t>Constancias Notariales: [[--]] Autorización de Tratamiento de Datos: El compareciente autoriza el tratamiento de sus datos personales conforme a lo dispuesto en la Ley 1581 de 2012. [[--]] Advertencia sobre Verificación de Datos: Se advierte al compareciente sobre la obligación de verificar la exactitud de los datos consignados en este instrumento, conforme al Artículo 102 del Decreto Ley 960 de 1970. [[--]] Deber de Consejo del Notario: El notario ha cumplido con el deber de consejo, informando al compareciente sobre el alcance y efectos legales del presente acto. [[--]]</w:t>
       </w:r>
     </w:p>
     <w:p/>
@@ -100,7 +100,7 @@
         <w:jc w:val="both"/>
       </w:pPr>
       <w:r>
-        <w:t>Liquidación de Derechos Notariales: [[--]] Derechos notariales: $185,000 [[--]] IVA: $35,150 [[--]] Aporte a la Superintendencia de Notariado y Registro: $6,500 [[--]] Fondo del Notariado: $5,200 [[--]] Total: $231,850 [[--]]</w:t>
+        <w:t>Liquidación de Derechos Notariales: [[--]] Derechos Notariales: $185,000 [[--]] IVA: $35,150 [[--]] Aporte Superintendencia: $6,500 [[--]] Fondo Notariado: $5,200 [[--]] Total: $231,850 [[--]]</w:t>
       </w:r>
     </w:p>
     <w:p/>
@@ -109,41 +109,7 @@
         <w:jc w:val="both"/>
       </w:pPr>
       <w:r>
-        <w:t>Firmas: [[--]] Gerónimo Giraldo Campo [[--]] Daniela Campo [[--]]</w:t>
-      </w:r>
-    </w:p>
-    <w:p/>
-    <w:p>
-      <w:pPr>
-        <w:jc w:val="both"/>
-      </w:pPr>
-      <w:r>
-        <w:t>Doy fe,</w:t>
-      </w:r>
-    </w:p>
-    <w:p/>
-    <w:p>
-      <w:pPr>
-        <w:jc w:val="both"/>
-      </w:pPr>
-      <w:r>
-        <w:t>Mateo Jaramillo Cadavid</w:t>
-      </w:r>
-    </w:p>
-    <w:p>
-      <w:pPr>
-        <w:jc w:val="both"/>
-      </w:pPr>
-      <w:r>
-        <w:t>Notario Titular</w:t>
-      </w:r>
-    </w:p>
-    <w:p>
-      <w:pPr>
-        <w:jc w:val="both"/>
-      </w:pPr>
-      <w:r>
-        <w:t>Notaría Única del Círculo de Bogotá</w:t>
+        <w:t>Firmas: [[--]] Firma del Poderdante: ___________________________ Gerónimo Giraldo Campo [[--]] Firma del Apoderado(a): ___________________________ Daniela Campo [[--]] Firma del Notario: ___________________________ Mateo Jaramillo Cadavid [[--]]</w:t>
       </w:r>
     </w:p>
     <w:sectPr>

</xml_diff>